<commit_message>
docs: add table of cotents for weekly status report of week 4
</commit_message>
<xml_diff>
--- a/docs/management/weekly/W04-status (29.10.2026).docx
+++ b/docs/management/weekly/W04-status (29.10.2026).docx
@@ -907,7 +907,7 @@
     </w:p>
     <w:sdt>
       <w:sdtPr>
-        <w:id w:val="1620460863"/>
+        <w:id w:val="-1717477774"/>
         <w:docPartObj>
           <w:docPartGallery w:val="Table of Contents"/>
           <w:docPartUnique w:val="1"/>
@@ -916,26 +916,14 @@
       <w:sdtContent>
         <w:p>
           <w:pPr>
-            <w:keepNext w:val="0"/>
-            <w:keepLines w:val="0"/>
-            <w:pageBreakBefore w:val="0"/>
-            <w:widowControl w:val="1"/>
-            <w:pBdr>
-              <w:top w:space="0" w:sz="0" w:val="nil"/>
-              <w:left w:space="0" w:sz="0" w:val="nil"/>
-              <w:bottom w:space="0" w:sz="0" w:val="nil"/>
-              <w:right w:space="0" w:sz="0" w:val="nil"/>
-              <w:between w:space="0" w:sz="0" w:val="nil"/>
-            </w:pBdr>
-            <w:shd w:fill="auto" w:val="clear"/>
+            <w:widowControl w:val="0"/>
             <w:tabs>
-              <w:tab w:val="right" w:leader="none" w:pos="9350"/>
+              <w:tab w:val="right" w:leader="none" w:pos="12000"/>
             </w:tabs>
-            <w:spacing w:after="0" w:before="0" w:line="360" w:lineRule="auto"/>
-            <w:ind w:left="0" w:right="0" w:firstLine="0"/>
-            <w:jc w:val="both"/>
+            <w:spacing w:before="60" w:line="240" w:lineRule="auto"/>
+            <w:jc w:val="left"/>
             <w:rPr>
-              <w:rFonts w:ascii="Quattrocento Sans" w:cs="Quattrocento Sans" w:eastAsia="Quattrocento Sans" w:hAnsi="Quattrocento Sans"/>
+              <w:rFonts w:ascii="Arial" w:cs="Arial" w:eastAsia="Arial" w:hAnsi="Arial"/>
               <w:b w:val="1"/>
               <w:bCs w:val="1"/>
               <w:i w:val="0"/>
@@ -943,8 +931,8 @@
               <w:smallCaps w:val="0"/>
               <w:strike w:val="0"/>
               <w:color w:val="000000"/>
-              <w:sz w:val="24"/>
-              <w:szCs w:val="24"/>
+              <w:sz w:val="22"/>
+              <w:szCs w:val="22"/>
               <w:u w:val="none"/>
               <w:shd w:fill="auto" w:val="clear"/>
               <w:vertAlign w:val="baseline"/>
@@ -955,9 +943,45 @@
             <w:instrText xml:space="preserve"> TOC \h \u \z \t "Heading 1,1,Heading 2,2,Heading 3,3,"</w:instrText>
             <w:fldChar w:fldCharType="separate"/>
           </w:r>
+          <w:hyperlink w:anchor="_heading=h.hjmwee4p892o">
+            <w:r>
+              <w:rPr>
+                <w:rFonts w:ascii="Arial" w:cs="Arial" w:eastAsia="Arial" w:hAnsi="Arial"/>
+                <w:b w:val="1"/>
+                <w:bCs w:val="1"/>
+                <w:i w:val="0"/>
+                <w:iCs w:val="0"/>
+                <w:smallCaps w:val="0"/>
+                <w:strike w:val="0"/>
+                <w:color w:val="000000"/>
+                <w:sz w:val="22"/>
+                <w:szCs w:val="22"/>
+                <w:u w:val="none"/>
+                <w:shd w:fill="auto" w:val="clear"/>
+                <w:vertAlign w:val="baseline"/>
+                <w:rtl w:val="0"/>
+              </w:rPr>
+              <w:t xml:space="preserve">Objectives</w:t>
+              <w:tab/>
+              <w:t xml:space="preserve">1</w:t>
+            </w:r>
+          </w:hyperlink>
           <w:r>
             <w:rPr>
-              <w:rFonts w:ascii="Quattrocento Sans" w:cs="Quattrocento Sans" w:eastAsia="Quattrocento Sans" w:hAnsi="Quattrocento Sans"/>
+              <w:rtl w:val="0"/>
+            </w:rPr>
+          </w:r>
+        </w:p>
+        <w:p>
+          <w:pPr>
+            <w:widowControl w:val="0"/>
+            <w:tabs>
+              <w:tab w:val="right" w:leader="none" w:pos="12000"/>
+            </w:tabs>
+            <w:spacing w:before="60" w:line="240" w:lineRule="auto"/>
+            <w:jc w:val="left"/>
+            <w:rPr>
+              <w:rFonts w:ascii="Arial" w:cs="Arial" w:eastAsia="Arial" w:hAnsi="Arial"/>
               <w:b w:val="1"/>
               <w:bCs w:val="1"/>
               <w:i w:val="0"/>
@@ -965,14 +989,363 @@
               <w:smallCaps w:val="0"/>
               <w:strike w:val="0"/>
               <w:color w:val="000000"/>
-              <w:sz w:val="24"/>
-              <w:szCs w:val="24"/>
+              <w:sz w:val="22"/>
+              <w:szCs w:val="22"/>
               <w:u w:val="none"/>
               <w:shd w:fill="auto" w:val="clear"/>
               <w:vertAlign w:val="baseline"/>
+            </w:rPr>
+          </w:pPr>
+          <w:hyperlink w:anchor="_heading=">
+            <w:r>
+              <w:rPr>
+                <w:rFonts w:ascii="Arial" w:cs="Arial" w:eastAsia="Arial" w:hAnsi="Arial"/>
+                <w:b w:val="1"/>
+                <w:bCs w:val="1"/>
+                <w:i w:val="0"/>
+                <w:iCs w:val="0"/>
+                <w:smallCaps w:val="0"/>
+                <w:strike w:val="0"/>
+                <w:color w:val="000000"/>
+                <w:sz w:val="22"/>
+                <w:szCs w:val="22"/>
+                <w:u w:val="none"/>
+                <w:shd w:fill="auto" w:val="clear"/>
+                <w:vertAlign w:val="baseline"/>
+                <w:rtl w:val="0"/>
+              </w:rPr>
+              <w:t xml:space="preserve">1 Submission</w:t>
+              <w:tab/>
+              <w:t xml:space="preserve">2</w:t>
+            </w:r>
+          </w:hyperlink>
+          <w:r>
+            <w:rPr>
               <w:rtl w:val="0"/>
             </w:rPr>
-            <w:t xml:space="preserve">Right-click here and choose “Update Field” to build the table of contents.</w:t>
+          </w:r>
+        </w:p>
+        <w:p>
+          <w:pPr>
+            <w:widowControl w:val="0"/>
+            <w:tabs>
+              <w:tab w:val="right" w:leader="none" w:pos="12000"/>
+            </w:tabs>
+            <w:spacing w:before="60" w:line="240" w:lineRule="auto"/>
+            <w:jc w:val="left"/>
+            <w:rPr>
+              <w:rFonts w:ascii="Arial" w:cs="Arial" w:eastAsia="Arial" w:hAnsi="Arial"/>
+              <w:b w:val="1"/>
+              <w:bCs w:val="1"/>
+              <w:i w:val="0"/>
+              <w:iCs w:val="0"/>
+              <w:smallCaps w:val="0"/>
+              <w:strike w:val="0"/>
+              <w:color w:val="000000"/>
+              <w:sz w:val="22"/>
+              <w:szCs w:val="22"/>
+              <w:u w:val="none"/>
+              <w:shd w:fill="auto" w:val="clear"/>
+              <w:vertAlign w:val="baseline"/>
+            </w:rPr>
+          </w:pPr>
+          <w:hyperlink w:anchor="_heading=">
+            <w:r>
+              <w:rPr>
+                <w:rFonts w:ascii="Arial" w:cs="Arial" w:eastAsia="Arial" w:hAnsi="Arial"/>
+                <w:b w:val="1"/>
+                <w:bCs w:val="1"/>
+                <w:i w:val="0"/>
+                <w:iCs w:val="0"/>
+                <w:smallCaps w:val="0"/>
+                <w:strike w:val="0"/>
+                <w:color w:val="000000"/>
+                <w:sz w:val="22"/>
+                <w:szCs w:val="22"/>
+                <w:u w:val="none"/>
+                <w:shd w:fill="auto" w:val="clear"/>
+                <w:vertAlign w:val="baseline"/>
+                <w:rtl w:val="0"/>
+              </w:rPr>
+              <w:t xml:space="preserve">2 Report Information</w:t>
+              <w:tab/>
+              <w:t xml:space="preserve">3</w:t>
+            </w:r>
+          </w:hyperlink>
+          <w:r>
+            <w:rPr>
+              <w:rtl w:val="0"/>
+            </w:rPr>
+          </w:r>
+        </w:p>
+        <w:p>
+          <w:pPr>
+            <w:widowControl w:val="0"/>
+            <w:tabs>
+              <w:tab w:val="right" w:leader="none" w:pos="12000"/>
+            </w:tabs>
+            <w:spacing w:before="60" w:line="240" w:lineRule="auto"/>
+            <w:ind w:left="360" w:firstLine="0"/>
+            <w:jc w:val="left"/>
+            <w:rPr>
+              <w:rFonts w:ascii="Arial" w:cs="Arial" w:eastAsia="Arial" w:hAnsi="Arial"/>
+              <w:b w:val="0"/>
+              <w:bCs w:val="0"/>
+              <w:i w:val="0"/>
+              <w:iCs w:val="0"/>
+              <w:smallCaps w:val="0"/>
+              <w:strike w:val="0"/>
+              <w:color w:val="000000"/>
+              <w:sz w:val="22"/>
+              <w:szCs w:val="22"/>
+              <w:u w:val="none"/>
+              <w:shd w:fill="auto" w:val="clear"/>
+              <w:vertAlign w:val="baseline"/>
+            </w:rPr>
+          </w:pPr>
+          <w:hyperlink w:anchor="_heading=">
+            <w:r>
+              <w:rPr>
+                <w:rFonts w:ascii="Arial" w:cs="Arial" w:eastAsia="Arial" w:hAnsi="Arial"/>
+                <w:b w:val="0"/>
+                <w:bCs w:val="0"/>
+                <w:i w:val="0"/>
+                <w:iCs w:val="0"/>
+                <w:smallCaps w:val="0"/>
+                <w:strike w:val="0"/>
+                <w:color w:val="000000"/>
+                <w:sz w:val="22"/>
+                <w:szCs w:val="22"/>
+                <w:u w:val="none"/>
+                <w:shd w:fill="auto" w:val="clear"/>
+                <w:vertAlign w:val="baseline"/>
+                <w:rtl w:val="0"/>
+              </w:rPr>
+              <w:t xml:space="preserve">2.1 Task Status</w:t>
+              <w:tab/>
+              <w:t xml:space="preserve">3</w:t>
+            </w:r>
+          </w:hyperlink>
+          <w:r>
+            <w:rPr>
+              <w:rtl w:val="0"/>
+            </w:rPr>
+          </w:r>
+        </w:p>
+        <w:p>
+          <w:pPr>
+            <w:widowControl w:val="0"/>
+            <w:tabs>
+              <w:tab w:val="right" w:leader="none" w:pos="12000"/>
+            </w:tabs>
+            <w:spacing w:before="60" w:line="240" w:lineRule="auto"/>
+            <w:ind w:left="360" w:firstLine="0"/>
+            <w:jc w:val="left"/>
+            <w:rPr>
+              <w:rFonts w:ascii="Arial" w:cs="Arial" w:eastAsia="Arial" w:hAnsi="Arial"/>
+              <w:b w:val="0"/>
+              <w:bCs w:val="0"/>
+              <w:i w:val="0"/>
+              <w:iCs w:val="0"/>
+              <w:smallCaps w:val="0"/>
+              <w:strike w:val="0"/>
+              <w:color w:val="000000"/>
+              <w:sz w:val="22"/>
+              <w:szCs w:val="22"/>
+              <w:u w:val="none"/>
+              <w:shd w:fill="auto" w:val="clear"/>
+              <w:vertAlign w:val="baseline"/>
+            </w:rPr>
+          </w:pPr>
+          <w:hyperlink w:anchor="_heading=">
+            <w:r>
+              <w:rPr>
+                <w:rFonts w:ascii="Arial" w:cs="Arial" w:eastAsia="Arial" w:hAnsi="Arial"/>
+                <w:b w:val="0"/>
+                <w:bCs w:val="0"/>
+                <w:i w:val="0"/>
+                <w:iCs w:val="0"/>
+                <w:smallCaps w:val="0"/>
+                <w:strike w:val="0"/>
+                <w:color w:val="000000"/>
+                <w:sz w:val="22"/>
+                <w:szCs w:val="22"/>
+                <w:u w:val="none"/>
+                <w:shd w:fill="auto" w:val="clear"/>
+                <w:vertAlign w:val="baseline"/>
+                <w:rtl w:val="0"/>
+              </w:rPr>
+              <w:t xml:space="preserve">2.2 Plan for Next Week</w:t>
+              <w:tab/>
+              <w:t xml:space="preserve">4</w:t>
+            </w:r>
+          </w:hyperlink>
+          <w:r>
+            <w:rPr>
+              <w:rtl w:val="0"/>
+            </w:rPr>
+          </w:r>
+        </w:p>
+        <w:p>
+          <w:pPr>
+            <w:widowControl w:val="0"/>
+            <w:tabs>
+              <w:tab w:val="right" w:leader="none" w:pos="12000"/>
+            </w:tabs>
+            <w:spacing w:before="60" w:line="240" w:lineRule="auto"/>
+            <w:ind w:left="360" w:firstLine="0"/>
+            <w:jc w:val="left"/>
+            <w:rPr>
+              <w:rFonts w:ascii="Arial" w:cs="Arial" w:eastAsia="Arial" w:hAnsi="Arial"/>
+              <w:b w:val="0"/>
+              <w:bCs w:val="0"/>
+              <w:i w:val="0"/>
+              <w:iCs w:val="0"/>
+              <w:smallCaps w:val="0"/>
+              <w:strike w:val="0"/>
+              <w:color w:val="000000"/>
+              <w:sz w:val="22"/>
+              <w:szCs w:val="22"/>
+              <w:u w:val="none"/>
+              <w:shd w:fill="auto" w:val="clear"/>
+              <w:vertAlign w:val="baseline"/>
+            </w:rPr>
+          </w:pPr>
+          <w:hyperlink w:anchor="_heading=">
+            <w:r>
+              <w:rPr>
+                <w:rFonts w:ascii="Arial" w:cs="Arial" w:eastAsia="Arial" w:hAnsi="Arial"/>
+                <w:b w:val="0"/>
+                <w:bCs w:val="0"/>
+                <w:i w:val="0"/>
+                <w:iCs w:val="0"/>
+                <w:smallCaps w:val="0"/>
+                <w:strike w:val="0"/>
+                <w:color w:val="000000"/>
+                <w:sz w:val="22"/>
+                <w:szCs w:val="22"/>
+                <w:u w:val="none"/>
+                <w:shd w:fill="auto" w:val="clear"/>
+                <w:vertAlign w:val="baseline"/>
+                <w:rtl w:val="0"/>
+              </w:rPr>
+              <w:t xml:space="preserve">2.3 Issues and Risks</w:t>
+              <w:tab/>
+              <w:t xml:space="preserve">4</w:t>
+            </w:r>
+          </w:hyperlink>
+          <w:r>
+            <w:rPr>
+              <w:rtl w:val="0"/>
+            </w:rPr>
+          </w:r>
+        </w:p>
+        <w:p>
+          <w:pPr>
+            <w:widowControl w:val="0"/>
+            <w:tabs>
+              <w:tab w:val="right" w:leader="none" w:pos="12000"/>
+            </w:tabs>
+            <w:spacing w:before="60" w:line="240" w:lineRule="auto"/>
+            <w:ind w:left="360" w:firstLine="0"/>
+            <w:jc w:val="left"/>
+            <w:rPr>
+              <w:rFonts w:ascii="Arial" w:cs="Arial" w:eastAsia="Arial" w:hAnsi="Arial"/>
+              <w:b w:val="0"/>
+              <w:bCs w:val="0"/>
+              <w:i w:val="0"/>
+              <w:iCs w:val="0"/>
+              <w:smallCaps w:val="0"/>
+              <w:strike w:val="0"/>
+              <w:color w:val="000000"/>
+              <w:sz w:val="22"/>
+              <w:szCs w:val="22"/>
+              <w:u w:val="none"/>
+              <w:shd w:fill="auto" w:val="clear"/>
+              <w:vertAlign w:val="baseline"/>
+            </w:rPr>
+          </w:pPr>
+          <w:hyperlink w:anchor="_heading=">
+            <w:r>
+              <w:rPr>
+                <w:rFonts w:ascii="Arial" w:cs="Arial" w:eastAsia="Arial" w:hAnsi="Arial"/>
+                <w:b w:val="0"/>
+                <w:bCs w:val="0"/>
+                <w:i w:val="0"/>
+                <w:iCs w:val="0"/>
+                <w:smallCaps w:val="0"/>
+                <w:strike w:val="0"/>
+                <w:color w:val="000000"/>
+                <w:sz w:val="22"/>
+                <w:szCs w:val="22"/>
+                <w:u w:val="none"/>
+                <w:shd w:fill="auto" w:val="clear"/>
+                <w:vertAlign w:val="baseline"/>
+                <w:rtl w:val="0"/>
+              </w:rPr>
+              <w:t xml:space="preserve">2.4 Meeting Minutes</w:t>
+              <w:tab/>
+              <w:t xml:space="preserve">5</w:t>
+            </w:r>
+          </w:hyperlink>
+          <w:r>
+            <w:rPr>
+              <w:rtl w:val="0"/>
+            </w:rPr>
+          </w:r>
+        </w:p>
+        <w:p>
+          <w:pPr>
+            <w:widowControl w:val="0"/>
+            <w:tabs>
+              <w:tab w:val="right" w:leader="none" w:pos="12000"/>
+            </w:tabs>
+            <w:spacing w:before="60" w:line="240" w:lineRule="auto"/>
+            <w:ind w:left="360" w:firstLine="0"/>
+            <w:jc w:val="left"/>
+            <w:rPr>
+              <w:rFonts w:ascii="Arial" w:cs="Arial" w:eastAsia="Arial" w:hAnsi="Arial"/>
+              <w:b w:val="0"/>
+              <w:bCs w:val="0"/>
+              <w:i w:val="0"/>
+              <w:iCs w:val="0"/>
+              <w:smallCaps w:val="0"/>
+              <w:strike w:val="0"/>
+              <w:color w:val="000000"/>
+              <w:sz w:val="22"/>
+              <w:szCs w:val="22"/>
+              <w:u w:val="none"/>
+              <w:shd w:fill="auto" w:val="clear"/>
+              <w:vertAlign w:val="baseline"/>
+            </w:rPr>
+          </w:pPr>
+          <w:hyperlink w:anchor="_heading=">
+            <w:r>
+              <w:rPr>
+                <w:rFonts w:ascii="Arial" w:cs="Arial" w:eastAsia="Arial" w:hAnsi="Arial"/>
+                <w:b w:val="0"/>
+                <w:bCs w:val="0"/>
+                <w:i w:val="0"/>
+                <w:iCs w:val="0"/>
+                <w:smallCaps w:val="0"/>
+                <w:strike w:val="0"/>
+                <w:color w:val="000000"/>
+                <w:sz w:val="22"/>
+                <w:szCs w:val="22"/>
+                <w:u w:val="none"/>
+                <w:shd w:fill="auto" w:val="clear"/>
+                <w:vertAlign w:val="baseline"/>
+                <w:rtl w:val="0"/>
+              </w:rPr>
+              <w:t xml:space="preserve">2.5 Metrics</w:t>
+              <w:tab/>
+              <w:t xml:space="preserve">6</w:t>
+            </w:r>
+          </w:hyperlink>
+          <w:r>
+            <w:rPr>
+              <w:rtl w:val="0"/>
+            </w:rPr>
           </w:r>
           <w:r>
             <w:fldChar w:fldCharType="end"/>
@@ -1840,7 +2213,7 @@
             </w:pPr>
             <w:sdt>
               <w:sdtPr>
-                <w:id w:val="-2040863775"/>
+                <w:id w:val="-33982930"/>
                 <w:tag w:val="goog_rdk_0"/>
               </w:sdtPr>
               <w:sdtContent>
@@ -2204,7 +2577,7 @@
             </w:pPr>
             <w:sdt>
               <w:sdtPr>
-                <w:id w:val="-1294582418"/>
+                <w:id w:val="121167404"/>
                 <w:tag w:val="goog_rdk_1"/>
               </w:sdtPr>
               <w:sdtContent>
@@ -2342,7 +2715,7 @@
             </w:pPr>
             <w:sdt>
               <w:sdtPr>
-                <w:id w:val="977951420"/>
+                <w:id w:val="-1720786931"/>
                 <w:tag w:val="goog_rdk_2"/>
               </w:sdtPr>
               <w:sdtContent>
@@ -2384,7 +2757,7 @@
             </w:pPr>
             <w:sdt>
               <w:sdtPr>
-                <w:id w:val="-279233329"/>
+                <w:id w:val="1663057430"/>
                 <w:tag w:val="goog_rdk_3"/>
               </w:sdtPr>
               <w:sdtContent>
@@ -2522,7 +2895,7 @@
             </w:pPr>
             <w:sdt>
               <w:sdtPr>
-                <w:id w:val="-1266714901"/>
+                <w:id w:val="40964628"/>
                 <w:tag w:val="goog_rdk_4"/>
               </w:sdtPr>
               <w:sdtContent>
@@ -2564,7 +2937,7 @@
             </w:pPr>
             <w:sdt>
               <w:sdtPr>
-                <w:id w:val="-98484725"/>
+                <w:id w:val="1242151063"/>
                 <w:tag w:val="goog_rdk_5"/>
               </w:sdtPr>
               <w:sdtContent>
@@ -2702,7 +3075,7 @@
             </w:pPr>
             <w:sdt>
               <w:sdtPr>
-                <w:id w:val="-1696504370"/>
+                <w:id w:val="1316882164"/>
                 <w:tag w:val="goog_rdk_6"/>
               </w:sdtPr>
               <w:sdtContent>
@@ -2744,7 +3117,7 @@
             </w:pPr>
             <w:sdt>
               <w:sdtPr>
-                <w:id w:val="-963456708"/>
+                <w:id w:val="360965984"/>
                 <w:tag w:val="goog_rdk_7"/>
               </w:sdtPr>
               <w:sdtContent>
@@ -2882,7 +3255,7 @@
             </w:pPr>
             <w:sdt>
               <w:sdtPr>
-                <w:id w:val="-24574533"/>
+                <w:id w:val="965333544"/>
                 <w:tag w:val="goog_rdk_8"/>
               </w:sdtPr>
               <w:sdtContent>
@@ -2924,7 +3297,7 @@
             </w:pPr>
             <w:sdt>
               <w:sdtPr>
-                <w:id w:val="-1441316154"/>
+                <w:id w:val="1252169087"/>
                 <w:tag w:val="goog_rdk_9"/>
               </w:sdtPr>
               <w:sdtContent>
@@ -3584,7 +3957,7 @@
             </w:pPr>
             <w:sdt>
               <w:sdtPr>
-                <w:id w:val="487279062"/>
+                <w:id w:val="250414373"/>
                 <w:tag w:val="goog_rdk_10"/>
               </w:sdtPr>
               <w:sdtContent>
@@ -3722,7 +4095,7 @@
             </w:pPr>
             <w:sdt>
               <w:sdtPr>
-                <w:id w:val="1863618454"/>
+                <w:id w:val="-584022411"/>
                 <w:tag w:val="goog_rdk_11"/>
               </w:sdtPr>
               <w:sdtContent>
@@ -4014,7 +4387,7 @@
             </w:pPr>
             <w:sdt>
               <w:sdtPr>
-                <w:id w:val="-1891150992"/>
+                <w:id w:val="1881051985"/>
                 <w:tag w:val="goog_rdk_12"/>
               </w:sdtPr>
               <w:sdtContent>
@@ -4093,7 +4466,7 @@
             </w:pPr>
             <w:sdt>
               <w:sdtPr>
-                <w:id w:val="801945596"/>
+                <w:id w:val="1985698172"/>
                 <w:tag w:val="goog_rdk_13"/>
               </w:sdtPr>
               <w:sdtContent>
@@ -4172,7 +4545,7 @@
             </w:pPr>
             <w:sdt>
               <w:sdtPr>
-                <w:id w:val="2063329005"/>
+                <w:id w:val="629734206"/>
                 <w:tag w:val="goog_rdk_14"/>
               </w:sdtPr>
               <w:sdtContent>
@@ -4461,7 +4834,7 @@
             </w:pPr>
             <w:sdt>
               <w:sdtPr>
-                <w:id w:val="1457736233"/>
+                <w:id w:val="-1992758944"/>
                 <w:tag w:val="goog_rdk_15"/>
               </w:sdtPr>
               <w:sdtContent>
@@ -4540,7 +4913,7 @@
             </w:pPr>
             <w:sdt>
               <w:sdtPr>
-                <w:id w:val="-1066451462"/>
+                <w:id w:val="880981622"/>
                 <w:tag w:val="goog_rdk_16"/>
               </w:sdtPr>
               <w:sdtContent>
@@ -4619,7 +4992,7 @@
             </w:pPr>
             <w:sdt>
               <w:sdtPr>
-                <w:id w:val="1926313529"/>
+                <w:id w:val="999804593"/>
                 <w:tag w:val="goog_rdk_17"/>
               </w:sdtPr>
               <w:sdtContent>
@@ -4698,7 +5071,7 @@
             </w:pPr>
             <w:sdt>
               <w:sdtPr>
-                <w:id w:val="1924096449"/>
+                <w:id w:val="-814860198"/>
                 <w:tag w:val="goog_rdk_18"/>
               </w:sdtPr>
               <w:sdtContent>
@@ -4777,7 +5150,7 @@
             </w:pPr>
             <w:sdt>
               <w:sdtPr>
-                <w:id w:val="-816169792"/>
+                <w:id w:val="-326964817"/>
                 <w:tag w:val="goog_rdk_19"/>
               </w:sdtPr>
               <w:sdtContent>
@@ -5172,7 +5545,7 @@
             </w:pPr>
             <w:sdt>
               <w:sdtPr>
-                <w:id w:val="-1902082379"/>
+                <w:id w:val="1250294586"/>
                 <w:tag w:val="goog_rdk_20"/>
               </w:sdtPr>
               <w:sdtContent>
@@ -5251,7 +5624,7 @@
             </w:pPr>
             <w:sdt>
               <w:sdtPr>
-                <w:id w:val="-1787260371"/>
+                <w:id w:val="1979323403"/>
                 <w:tag w:val="goog_rdk_21"/>
               </w:sdtPr>
               <w:sdtContent>
@@ -5400,7 +5773,7 @@
             </w:pPr>
             <w:sdt>
               <w:sdtPr>
-                <w:id w:val="-294512674"/>
+                <w:id w:val="-987930428"/>
                 <w:tag w:val="goog_rdk_22"/>
               </w:sdtPr>
               <w:sdtContent>
@@ -5479,7 +5852,7 @@
             </w:pPr>
             <w:sdt>
               <w:sdtPr>
-                <w:id w:val="-328694693"/>
+                <w:id w:val="-1696570319"/>
                 <w:tag w:val="goog_rdk_23"/>
               </w:sdtPr>
               <w:sdtContent>
@@ -5558,7 +5931,7 @@
             </w:pPr>
             <w:sdt>
               <w:sdtPr>
-                <w:id w:val="-345346497"/>
+                <w:id w:val="1684499977"/>
                 <w:tag w:val="goog_rdk_24"/>
               </w:sdtPr>
               <w:sdtContent>
@@ -5958,7 +6331,7 @@
             </w:pPr>
             <w:sdt>
               <w:sdtPr>
-                <w:id w:val="-1228457232"/>
+                <w:id w:val="2000854698"/>
                 <w:tag w:val="goog_rdk_25"/>
               </w:sdtPr>
               <w:sdtContent>
@@ -6099,7 +6472,7 @@
             </w:pPr>
             <w:sdt>
               <w:sdtPr>
-                <w:id w:val="981753775"/>
+                <w:id w:val="-832528425"/>
                 <w:tag w:val="goog_rdk_26"/>
               </w:sdtPr>
               <w:sdtContent>
@@ -6240,7 +6613,7 @@
             </w:pPr>
             <w:sdt>
               <w:sdtPr>
-                <w:id w:val="-631970616"/>
+                <w:id w:val="907985306"/>
                 <w:tag w:val="goog_rdk_27"/>
               </w:sdtPr>
               <w:sdtContent>
@@ -6381,7 +6754,7 @@
             </w:pPr>
             <w:sdt>
               <w:sdtPr>
-                <w:id w:val="5840621"/>
+                <w:id w:val="-1987484834"/>
                 <w:tag w:val="goog_rdk_28"/>
               </w:sdtPr>
               <w:sdtContent>
@@ -6656,7 +7029,7 @@
             </w:pPr>
             <w:sdt>
               <w:sdtPr>
-                <w:id w:val="-384047335"/>
+                <w:id w:val="-553662325"/>
                 <w:tag w:val="goog_rdk_29"/>
               </w:sdtPr>
               <w:sdtContent>
@@ -6835,7 +7208,7 @@
             </w:pPr>
             <w:sdt>
               <w:sdtPr>
-                <w:id w:val="1099177342"/>
+                <w:id w:val="1156771450"/>
                 <w:tag w:val="goog_rdk_30"/>
               </w:sdtPr>
               <w:sdtContent>
@@ -7257,7 +7630,7 @@
             </w:pPr>
             <w:sdt>
               <w:sdtPr>
-                <w:id w:val="-1262231465"/>
+                <w:id w:val="1028591285"/>
                 <w:tag w:val="goog_rdk_31"/>
               </w:sdtPr>
               <w:sdtContent>
@@ -7875,28 +8248,28 @@
                 <w:szCs w:val="20"/>
                 <w:rtl w:val="0"/>
               </w:rPr>
-              <w:t xml:space="preserve">11</w:t>
-            </w:r>
-          </w:p>
-        </w:tc>
-        <w:tc>
-          <w:tcPr/>
-          <w:p>
-            <w:pPr>
-              <w:spacing w:after="40" w:lineRule="auto"/>
-              <w:jc w:val="left"/>
-              <w:rPr>
-                <w:sz w:val="20"/>
-                <w:szCs w:val="20"/>
-              </w:rPr>
-            </w:pPr>
-            <w:r>
-              <w:rPr>
-                <w:sz w:val="20"/>
-                <w:szCs w:val="20"/>
-                <w:rtl w:val="0"/>
-              </w:rPr>
-              <w:t xml:space="preserve">25</w:t>
+              <w:t xml:space="preserve">12</w:t>
+            </w:r>
+          </w:p>
+        </w:tc>
+        <w:tc>
+          <w:tcPr/>
+          <w:p>
+            <w:pPr>
+              <w:spacing w:after="40" w:lineRule="auto"/>
+              <w:jc w:val="left"/>
+              <w:rPr>
+                <w:sz w:val="20"/>
+                <w:szCs w:val="20"/>
+              </w:rPr>
+            </w:pPr>
+            <w:r>
+              <w:rPr>
+                <w:sz w:val="20"/>
+                <w:szCs w:val="20"/>
+                <w:rtl w:val="0"/>
+              </w:rPr>
+              <w:t xml:space="preserve">26</w:t>
             </w:r>
           </w:p>
         </w:tc>

</xml_diff>